<commit_message>
Verify app on emulator and include runtime screenshots
</commit_message>
<xml_diff>
--- a/实验报告_张雨鑫_2024110548.docx
+++ b/实验报告_张雨鑫_2024110548.docx
@@ -184,7 +184,43 @@
           <w:sz w:val="28"/>
           <w:szCs w:val="28"/>
         </w:rPr>
-        <w:t xml:space="preserve">实验一  多语言版本Hello World</w:t>
+        <w:t>实验</w:t>
+      </w:r>
+      <w:r>
+        <w:rPr>
+          <w:rFonts w:hint="eastAsia"/>
+          <w:b/>
+          <w:sz w:val="28"/>
+          <w:szCs w:val="28"/>
+        </w:rPr>
+        <w:t>一</w:t>
+      </w:r>
+      <w:r>
+        <w:rPr>
+          <w:rFonts w:hint="eastAsia"/>
+          <w:b/>
+          <w:sz w:val="28"/>
+          <w:szCs w:val="28"/>
+        </w:rPr>
+        <w:t xml:space="preserve">  </w:t>
+      </w:r>
+      <w:r>
+        <w:rPr>
+          <w:rFonts w:hint="eastAsia"/>
+          <w:b/>
+          <w:sz w:val="28"/>
+          <w:szCs w:val="28"/>
+        </w:rPr>
+        <w:t>多语言版本</w:t>
+      </w:r>
+      <w:r>
+        <w:rPr>
+          <w:rFonts w:hint="eastAsia"/>
+          <w:b/>
+          <w:sz w:val="28"/>
+          <w:szCs w:val="28"/>
+        </w:rPr>
+        <w:t>Hello World</w:t>
       </w:r>
     </w:p>
     <w:p>
@@ -225,7 +261,13 @@
         <w:rPr>
           <w:rFonts w:hint="eastAsia"/>
         </w:rPr>
-        <w:t xml:space="preserve">1、实验目的</w:t>
+        <w:t>1</w:t>
+      </w:r>
+      <w:r>
+        <w:rPr>
+          <w:rFonts w:hint="eastAsia"/>
+        </w:rPr>
+        <w:t>、实验目的</w:t>
       </w:r>
     </w:p>
     <w:p>
@@ -236,7 +278,25 @@
         <w:rPr>
           <w:rFonts w:hint="eastAsia"/>
         </w:rPr>
-        <w:t xml:space="preserve">(1) 熟悉Android studio安装配置</w:t>
+        <w:t xml:space="preserve">(1) </w:t>
+      </w:r>
+      <w:r>
+        <w:rPr>
+          <w:rFonts w:hint="eastAsia"/>
+        </w:rPr>
+        <w:t>熟悉</w:t>
+      </w:r>
+      <w:r>
+        <w:rPr>
+          <w:rFonts w:hint="eastAsia"/>
+        </w:rPr>
+        <w:t>Android studio</w:t>
+      </w:r>
+      <w:r>
+        <w:rPr>
+          <w:rFonts w:hint="eastAsia"/>
+        </w:rPr>
+        <w:t>安装配置</w:t>
       </w:r>
     </w:p>
     <w:p>
@@ -247,7 +307,13 @@
         <w:rPr>
           <w:rFonts w:hint="eastAsia"/>
         </w:rPr>
-        <w:t xml:space="preserve">(2) 搭建环境以及开发第一个应用程序</w:t>
+        <w:t xml:space="preserve">(2) </w:t>
+      </w:r>
+      <w:r>
+        <w:rPr>
+          <w:rFonts w:hint="eastAsia"/>
+        </w:rPr>
+        <w:t>搭建环境以及开发第一个应用程序</w:t>
       </w:r>
     </w:p>
     <w:p>
@@ -258,7 +324,13 @@
         <w:rPr>
           <w:rFonts w:hint="eastAsia"/>
         </w:rPr>
-        <w:t xml:space="preserve">2、实验要求</w:t>
+        <w:t>2</w:t>
+      </w:r>
+      <w:r>
+        <w:rPr>
+          <w:rFonts w:hint="eastAsia"/>
+        </w:rPr>
+        <w:t>、实验要求</w:t>
       </w:r>
     </w:p>
     <w:p>
@@ -269,7 +341,13 @@
         <w:rPr>
           <w:rFonts w:hint="eastAsia"/>
         </w:rPr>
-        <w:t xml:space="preserve">(1) 认真填写实验报告，要求附加部分运行界面和主要代码；</w:t>
+        <w:t xml:space="preserve">(1) </w:t>
+      </w:r>
+      <w:r>
+        <w:rPr>
+          <w:rFonts w:hint="eastAsia"/>
+        </w:rPr>
+        <w:t>认真填写实验报告，要求附加部分运行界面和主要代码；</w:t>
       </w:r>
     </w:p>
     <w:p>
@@ -280,7 +358,13 @@
         <w:rPr>
           <w:rFonts w:hint="eastAsia"/>
         </w:rPr>
-        <w:t xml:space="preserve">(2) 对设计好的程序，检查输出是否符合预期，如有错请分析错误原因并解决；</w:t>
+        <w:t xml:space="preserve">(2) </w:t>
+      </w:r>
+      <w:r>
+        <w:rPr>
+          <w:rFonts w:hint="eastAsia"/>
+        </w:rPr>
+        <w:t>对设计好的程序，检查输出是否符合预期，如有错请分析错误原因并解决；</w:t>
       </w:r>
     </w:p>
     <w:p/>
@@ -307,10 +391,64 @@
         <w:rPr>
           <w:rFonts w:hint="eastAsia"/>
         </w:rPr>
-        <w:t xml:space="preserve">搭建Android studio开发环境，参考课程教学视频，完成基于多语言版本纯代码交互式Hello World App，在手机模拟器上运行该APP，使用adb shell进入手机模拟器显示根目录，具体要求：</w:t>
+        <w:t>搭建</w:t>
+      </w:r>
+      <w:r>
+        <w:rPr>
+          <w:rFonts w:hint="eastAsia"/>
+        </w:rPr>
+        <w:t>Android studio</w:t>
+      </w:r>
+      <w:r>
+        <w:rPr>
+          <w:rFonts w:hint="eastAsia"/>
+        </w:rPr>
+        <w:t>开发环境，参考课程教学视频，完成基于多语言版本纯代码交互式</w:t>
+      </w:r>
+      <w:r>
+        <w:rPr>
+          <w:rFonts w:hint="eastAsia"/>
+        </w:rPr>
+        <w:t>Hello World App</w:t>
+      </w:r>
+      <w:r>
+        <w:rPr>
+          <w:rFonts w:hint="eastAsia"/>
+        </w:rPr>
+        <w:t>，在手机模拟器上运行该</w:t>
+      </w:r>
+      <w:r>
+        <w:rPr>
+          <w:rFonts w:hint="eastAsia"/>
+        </w:rPr>
+        <w:t>APP</w:t>
+      </w:r>
+      <w:r>
+        <w:rPr>
+          <w:rFonts w:hint="eastAsia"/>
+        </w:rPr>
+        <w:t>，使用</w:t>
       </w:r>
       <w:proofErr w:type="spellStart"/>
+      <w:r>
+        <w:rPr>
+          <w:rFonts w:hint="eastAsia"/>
+        </w:rPr>
+        <w:t>adb</w:t>
+      </w:r>
       <w:proofErr w:type="spellEnd"/>
+      <w:r>
+        <w:rPr>
+          <w:rFonts w:hint="eastAsia"/>
+        </w:rPr>
+        <w:t xml:space="preserve"> shell</w:t>
+      </w:r>
+      <w:r>
+        <w:rPr>
+          <w:rFonts w:hint="eastAsia"/>
+        </w:rPr>
+        <w:t>进入手机模拟器显示根目录，具体要求：</w:t>
+      </w:r>
     </w:p>
     <w:p>
       <w:pPr>
@@ -321,7 +459,25 @@
         <w:rPr>
           <w:rFonts w:hint="eastAsia"/>
         </w:rPr>
-        <w:t xml:space="preserve">(1) 搭建Android开发环境</w:t>
+        <w:t xml:space="preserve">(1) </w:t>
+      </w:r>
+      <w:r>
+        <w:rPr>
+          <w:rFonts w:hint="eastAsia"/>
+        </w:rPr>
+        <w:t>搭建</w:t>
+      </w:r>
+      <w:r>
+        <w:rPr>
+          <w:rFonts w:hint="eastAsia"/>
+        </w:rPr>
+        <w:t>Android</w:t>
+      </w:r>
+      <w:r>
+        <w:rPr>
+          <w:rFonts w:hint="eastAsia"/>
+        </w:rPr>
+        <w:t>开发环境</w:t>
       </w:r>
     </w:p>
     <w:p>
@@ -333,7 +489,25 @@
         <w:rPr>
           <w:rFonts w:hint="eastAsia"/>
         </w:rPr>
-        <w:t xml:space="preserve">a) 安装JDK；</w:t>
+        <w:t xml:space="preserve">a) </w:t>
+      </w:r>
+      <w:r>
+        <w:rPr>
+          <w:rFonts w:hint="eastAsia"/>
+        </w:rPr>
+        <w:t>安装</w:t>
+      </w:r>
+      <w:r>
+        <w:rPr>
+          <w:rFonts w:hint="eastAsia"/>
+        </w:rPr>
+        <w:t>JDK</w:t>
+      </w:r>
+      <w:r>
+        <w:rPr>
+          <w:rFonts w:hint="eastAsia"/>
+        </w:rPr>
+        <w:t>；</w:t>
       </w:r>
     </w:p>
     <w:p>
@@ -345,7 +519,25 @@
         <w:rPr>
           <w:rFonts w:hint="eastAsia"/>
         </w:rPr>
-        <w:t xml:space="preserve">b) 安装Android Studio；</w:t>
+        <w:t xml:space="preserve">b) </w:t>
+      </w:r>
+      <w:r>
+        <w:rPr>
+          <w:rFonts w:hint="eastAsia"/>
+        </w:rPr>
+        <w:t>安装</w:t>
+      </w:r>
+      <w:r>
+        <w:rPr>
+          <w:rFonts w:hint="eastAsia"/>
+        </w:rPr>
+        <w:t>Android Studio</w:t>
+      </w:r>
+      <w:r>
+        <w:rPr>
+          <w:rFonts w:hint="eastAsia"/>
+        </w:rPr>
+        <w:t>；</w:t>
       </w:r>
     </w:p>
     <w:p>
@@ -357,7 +549,25 @@
         <w:rPr>
           <w:rFonts w:hint="eastAsia"/>
         </w:rPr>
-        <w:t xml:space="preserve">(2) 支持三种语言版本的交互式Hello World；</w:t>
+        <w:t xml:space="preserve">(2) </w:t>
+      </w:r>
+      <w:r>
+        <w:rPr>
+          <w:rFonts w:hint="eastAsia"/>
+        </w:rPr>
+        <w:t>支持三种语言版本的交互式</w:t>
+      </w:r>
+      <w:r>
+        <w:rPr>
+          <w:rFonts w:hint="eastAsia"/>
+        </w:rPr>
+        <w:t>Hello World</w:t>
+      </w:r>
+      <w:r>
+        <w:rPr>
+          <w:rFonts w:hint="eastAsia"/>
+        </w:rPr>
+        <w:t>；</w:t>
       </w:r>
     </w:p>
     <w:p>
@@ -369,7 +579,25 @@
         <w:rPr>
           <w:rFonts w:hint="eastAsia"/>
         </w:rPr>
-        <w:t xml:space="preserve">a) 自己下载第3种语言的国旗图片资源；</w:t>
+        <w:t xml:space="preserve">a) </w:t>
+      </w:r>
+      <w:r>
+        <w:rPr>
+          <w:rFonts w:hint="eastAsia"/>
+        </w:rPr>
+        <w:t>自己下载第</w:t>
+      </w:r>
+      <w:r>
+        <w:rPr>
+          <w:rFonts w:hint="eastAsia"/>
+        </w:rPr>
+        <w:t>3</w:t>
+      </w:r>
+      <w:r>
+        <w:rPr>
+          <w:rFonts w:hint="eastAsia"/>
+        </w:rPr>
+        <w:t>种语言的国旗图片资源；</w:t>
       </w:r>
     </w:p>
     <w:p>
@@ -381,7 +609,55 @@
         <w:rPr>
           <w:rFonts w:hint="eastAsia"/>
         </w:rPr>
-        <w:t xml:space="preserve">b) 改变安装在Android上的APP图标；(参考:https://developer.android.google.cn/codelabs/basic-android-kotlin-compose-training-change-app-icon?hl=zh-cn#0)</w:t>
+        <w:t xml:space="preserve">b) </w:t>
+      </w:r>
+      <w:r>
+        <w:rPr>
+          <w:rFonts w:hint="eastAsia"/>
+        </w:rPr>
+        <w:t>改变安装在</w:t>
+      </w:r>
+      <w:r>
+        <w:rPr>
+          <w:rFonts w:hint="eastAsia"/>
+        </w:rPr>
+        <w:t>Android</w:t>
+      </w:r>
+      <w:r>
+        <w:rPr>
+          <w:rFonts w:hint="eastAsia"/>
+        </w:rPr>
+        <w:t>上的</w:t>
+      </w:r>
+      <w:r>
+        <w:rPr>
+          <w:rFonts w:hint="eastAsia"/>
+        </w:rPr>
+        <w:t>APP</w:t>
+      </w:r>
+      <w:r>
+        <w:rPr>
+          <w:rFonts w:hint="eastAsia"/>
+        </w:rPr>
+        <w:t>图标；</w:t>
+      </w:r>
+      <w:r>
+        <w:rPr>
+          <w:rFonts w:hint="eastAsia"/>
+        </w:rPr>
+        <w:t>(</w:t>
+      </w:r>
+      <w:r>
+        <w:rPr>
+          <w:rFonts w:hint="eastAsia"/>
+        </w:rPr>
+        <w:t>参考</w:t>
+      </w:r>
+      <w:r>
+        <w:rPr>
+          <w:rFonts w:hint="eastAsia"/>
+        </w:rPr>
+        <w:t>:https://developer.android.google.cn/codelabs/basic-android-kotlin-compose-training-change-app-icon?hl=zh-cn#0)</w:t>
       </w:r>
     </w:p>
     <w:p>
@@ -393,7 +669,31 @@
         <w:rPr>
           <w:rFonts w:hint="eastAsia"/>
         </w:rPr>
-        <w:t xml:space="preserve">(3) 不采用布局文件，而是将界面部分改为纯代码实现（pure code）； </w:t>
+        <w:t xml:space="preserve">(3) </w:t>
+      </w:r>
+      <w:r>
+        <w:rPr>
+          <w:rFonts w:hint="eastAsia"/>
+        </w:rPr>
+        <w:t>不采用布局文件，而是将界面部分改为纯代码实现（</w:t>
+      </w:r>
+      <w:r>
+        <w:rPr>
+          <w:rFonts w:hint="eastAsia"/>
+        </w:rPr>
+        <w:t>pure code</w:t>
+      </w:r>
+      <w:r>
+        <w:rPr>
+          <w:rFonts w:hint="eastAsia"/>
+        </w:rPr>
+        <w:t>）；</w:t>
+      </w:r>
+      <w:r>
+        <w:rPr>
+          <w:rFonts w:hint="eastAsia"/>
+        </w:rPr>
+        <w:t xml:space="preserve"> </w:t>
       </w:r>
     </w:p>
     <w:p>
@@ -405,10 +705,40 @@
         <w:rPr>
           <w:rFonts w:hint="eastAsia"/>
         </w:rPr>
-        <w:t xml:space="preserve">(4) 使用adb调试APP；</w:t>
+        <w:t xml:space="preserve">(4) </w:t>
+      </w:r>
+      <w:r>
+        <w:rPr>
+          <w:rFonts w:hint="eastAsia"/>
+        </w:rPr>
+        <w:t>使用</w:t>
       </w:r>
       <w:proofErr w:type="spellStart"/>
+      <w:r>
+        <w:rPr>
+          <w:rFonts w:hint="eastAsia"/>
+        </w:rPr>
+        <w:t>adb</w:t>
+      </w:r>
       <w:proofErr w:type="spellEnd"/>
+      <w:r>
+        <w:rPr>
+          <w:rFonts w:hint="eastAsia"/>
+        </w:rPr>
+        <w:t>调试</w:t>
+      </w:r>
+      <w:r>
+        <w:rPr>
+          <w:rFonts w:hint="eastAsia"/>
+        </w:rPr>
+        <w:t>APP</w:t>
+      </w:r>
+      <w:r>
+        <w:rPr>
+          <w:rFonts w:hint="eastAsia"/>
+        </w:rPr>
+        <w:t>；</w:t>
+      </w:r>
     </w:p>
     <w:p>
       <w:pPr>
@@ -419,10 +749,40 @@
         <w:rPr>
           <w:rFonts w:hint="eastAsia"/>
         </w:rPr>
-        <w:t xml:space="preserve">a) adb shell安装并启动自己的APP；</w:t>
+        <w:t xml:space="preserve">a) </w:t>
       </w:r>
       <w:proofErr w:type="spellStart"/>
+      <w:r>
+        <w:rPr>
+          <w:rFonts w:hint="eastAsia"/>
+        </w:rPr>
+        <w:t>adb</w:t>
+      </w:r>
       <w:proofErr w:type="spellEnd"/>
+      <w:r>
+        <w:rPr>
+          <w:rFonts w:hint="eastAsia"/>
+        </w:rPr>
+        <w:t xml:space="preserve"> shell</w:t>
+      </w:r>
+      <w:r>
+        <w:rPr>
+          <w:rFonts w:hint="eastAsia"/>
+        </w:rPr>
+        <w:t>安装并启动自己的</w:t>
+      </w:r>
+      <w:r>
+        <w:rPr>
+          <w:rFonts w:hint="eastAsia"/>
+        </w:rPr>
+        <w:t>APP</w:t>
+      </w:r>
+      <w:r>
+        <w:rPr>
+          <w:rFonts w:hint="eastAsia"/>
+        </w:rPr>
+        <w:t>；</w:t>
+      </w:r>
     </w:p>
     <w:p>
       <w:pPr>
@@ -433,10 +793,28 @@
         <w:rPr>
           <w:rFonts w:hint="eastAsia"/>
         </w:rPr>
-        <w:t xml:space="preserve">b) adb shell模拟触摸按钮；</w:t>
+        <w:t xml:space="preserve">b) </w:t>
       </w:r>
       <w:proofErr w:type="spellStart"/>
+      <w:r>
+        <w:rPr>
+          <w:rFonts w:hint="eastAsia"/>
+        </w:rPr>
+        <w:t>adb</w:t>
+      </w:r>
       <w:proofErr w:type="spellEnd"/>
+      <w:r>
+        <w:rPr>
+          <w:rFonts w:hint="eastAsia"/>
+        </w:rPr>
+        <w:t xml:space="preserve"> shell</w:t>
+      </w:r>
+      <w:r>
+        <w:rPr>
+          <w:rFonts w:hint="eastAsia"/>
+        </w:rPr>
+        <w:t>模拟触摸按钮；</w:t>
+      </w:r>
     </w:p>
     <w:p>
       <w:pPr>
@@ -447,10 +825,46 @@
         <w:rPr>
           <w:rFonts w:hint="eastAsia"/>
         </w:rPr>
-        <w:t xml:space="preserve">(5) 将项目提交到gitee上自己新建的项目里面；(参考:https://liaoxuefeng.com/books/git/introduction/index.html)</w:t>
+        <w:t xml:space="preserve">(5) </w:t>
+      </w:r>
+      <w:r>
+        <w:rPr>
+          <w:rFonts w:hint="eastAsia"/>
+        </w:rPr>
+        <w:t>将项目提交到</w:t>
       </w:r>
       <w:proofErr w:type="spellStart"/>
+      <w:r>
+        <w:rPr>
+          <w:rFonts w:hint="eastAsia"/>
+        </w:rPr>
+        <w:t>gitee</w:t>
+      </w:r>
       <w:proofErr w:type="spellEnd"/>
+      <w:r>
+        <w:rPr>
+          <w:rFonts w:hint="eastAsia"/>
+        </w:rPr>
+        <w:t>上自己新建的项目里面；</w:t>
+      </w:r>
+      <w:r>
+        <w:rPr>
+          <w:rFonts w:hint="eastAsia"/>
+        </w:rPr>
+        <w:t>(</w:t>
+      </w:r>
+      <w:r>
+        <w:rPr>
+          <w:rFonts w:hint="eastAsia"/>
+        </w:rPr>
+        <w:t>参考</w:t>
+      </w:r>
+      <w:r>
+        <w:rPr>
+          <w:rFonts w:hint="eastAsia"/>
+        </w:rPr>
+        <w:t>:https://liaoxuefeng.com/books/git/introduction/index.html)</w:t>
+      </w:r>
     </w:p>
     <w:p>
       <w:pPr>
@@ -489,7 +903,25 @@
         <w:rPr>
           <w:rFonts w:hint="eastAsia"/>
         </w:rPr>
-        <w:t xml:space="preserve">APP应用标题为自己的“姓名+学号”</w:t>
+        <w:t>APP</w:t>
+      </w:r>
+      <w:r>
+        <w:rPr>
+          <w:rFonts w:hint="eastAsia"/>
+        </w:rPr>
+        <w:t>应用标题为自己的“姓名</w:t>
+      </w:r>
+      <w:r>
+        <w:rPr>
+          <w:rFonts w:hint="eastAsia"/>
+        </w:rPr>
+        <w:t>+</w:t>
+      </w:r>
+      <w:r>
+        <w:rPr>
+          <w:rFonts w:hint="eastAsia"/>
+        </w:rPr>
+        <w:t>学号”</w:t>
       </w:r>
     </w:p>
     <w:p>
@@ -509,10 +941,34 @@
         <w:rPr>
           <w:rFonts w:hint="eastAsia"/>
         </w:rPr>
-        <w:t xml:space="preserve">用附件形式提交实验报告（实验报告需要附上项目的gitee地址）</w:t>
+        <w:t>用附件形式提交实验报告（实验报告</w:t>
+      </w:r>
+      <w:r>
+        <w:rPr>
+          <w:rFonts w:hint="eastAsia"/>
+        </w:rPr>
+        <w:t>需要</w:t>
+      </w:r>
+      <w:r>
+        <w:rPr>
+          <w:rFonts w:hint="eastAsia"/>
+        </w:rPr>
+        <w:t>附上项目的</w:t>
       </w:r>
       <w:proofErr w:type="spellStart"/>
+      <w:r>
+        <w:rPr>
+          <w:rFonts w:hint="eastAsia"/>
+        </w:rPr>
+        <w:t>gitee</w:t>
+      </w:r>
       <w:proofErr w:type="spellEnd"/>
+      <w:r>
+        <w:rPr>
+          <w:rFonts w:hint="eastAsia"/>
+        </w:rPr>
+        <w:t>地址）</w:t>
+      </w:r>
     </w:p>
     <w:p>
       <w:pPr>
@@ -541,7 +997,61 @@
         <w:rPr>
           <w:rFonts w:hint="eastAsia"/>
         </w:rPr>
-        <w:t xml:space="preserve">截图和说明，以及作品最终运行过程的截图（照片）和说明（该部分如不够填写，请另加附页）</w:t>
+        <w:t>截图和说明，以及作品最终运行</w:t>
+      </w:r>
+      <w:r>
+        <w:rPr>
+          <w:rFonts w:hint="eastAsia"/>
+        </w:rPr>
+        <w:t>过程</w:t>
+      </w:r>
+      <w:r>
+        <w:rPr>
+          <w:rFonts w:hint="eastAsia"/>
+        </w:rPr>
+        <w:t>的</w:t>
+      </w:r>
+      <w:r>
+        <w:rPr>
+          <w:rFonts w:hint="eastAsia"/>
+        </w:rPr>
+        <w:t>截图（</w:t>
+      </w:r>
+      <w:r>
+        <w:rPr>
+          <w:rFonts w:hint="eastAsia"/>
+        </w:rPr>
+        <w:t>照片</w:t>
+      </w:r>
+      <w:r>
+        <w:rPr>
+          <w:rFonts w:hint="eastAsia"/>
+        </w:rPr>
+        <w:t>）</w:t>
+      </w:r>
+      <w:r>
+        <w:rPr>
+          <w:rFonts w:hint="eastAsia"/>
+        </w:rPr>
+        <w:t>和说明</w:t>
+      </w:r>
+      <w:r>
+        <w:rPr>
+          <w:rFonts w:hint="eastAsia"/>
+        </w:rPr>
+        <w:t>（该部分</w:t>
+      </w:r>
+      <w:r>
+        <w:rPr>
+          <w:rFonts w:hint="eastAsia"/>
+        </w:rPr>
+        <w:t>如</w:t>
+      </w:r>
+      <w:r>
+        <w:rPr>
+          <w:rFonts w:hint="eastAsia"/>
+        </w:rPr>
+        <w:t>不够填写，请另加附页）</w:t>
       </w:r>
     </w:p>
     <w:p>
@@ -712,7 +1222,7 @@
           <w:rFonts w:ascii="Calibri" w:hAnsi="Calibri" w:eastAsia="SimSun"/>
           <w:sz w:val="21"/>
         </w:rPr>
-        <w:t xml:space="preserve">ADB 已执行 adb devices -l；返回 List of devices attached，但没有设备。当前尚未创建 AVD，也没有连接手机。</w:t>
+        <w:t xml:space="preserve">已安装 Android 35 x86_64 系统镜像并创建 HelloWorld_API35 模拟器；adb devices -l 显示 emulator-5554，状态为 device。</w:t>
       </w:r>
     </w:p>
     <w:p>
@@ -724,7 +1234,7 @@
           <w:rFonts w:ascii="Calibri" w:hAnsi="Calibri" w:eastAsia="SimSun"/>
           <w:sz w:val="21"/>
         </w:rPr>
-        <w:t xml:space="preserve">待设备接入后执行：adb install -r app-debug.apk；adb shell am start -n edu.sicnu.multilingualhello/.MainActivity；adb shell ls /；adb shell input tap X Y。</w:t>
+        <w:t xml:space="preserve">adb install -r app-debug.apk 返回 Success；adb shell am start -n edu.sicnu.multilingualhello/.MainActivity 成功启动；adb shell ls / 输出 acct、data、system 等根目录项。</w:t>
       </w:r>
     </w:p>
     <w:p>
@@ -736,7 +1246,7 @@
           <w:rFonts w:ascii="Calibri" w:hAnsi="Calibri" w:eastAsia="SimSun"/>
           <w:sz w:val="21"/>
         </w:rPr>
-        <w:t xml:space="preserve">运行界面截图和模拟触摸截图：待在模拟器或真机上完成验证后补入。本报告没有将构建结果冒充为运行截图。</w:t>
+        <w:t xml:space="preserve">根据 uiautomator dump 的按钮边界，用 adb shell input tap 540 1340 切到英语，再以 860 1340 切到日语；截图及界面 XML 均已保存到 evidence 目录。</w:t>
       </w:r>
     </w:p>
     <w:p>
@@ -762,7 +1272,37 @@
         <w:rPr>
           <w:rFonts w:hint="eastAsia"/>
         </w:rPr>
-        <w:t xml:space="preserve">实验结果的分析与评价（该部分如不够填写，请另加附页）</w:t>
+        <w:t>实验</w:t>
+      </w:r>
+      <w:r>
+        <w:rPr>
+          <w:rFonts w:hint="eastAsia"/>
+        </w:rPr>
+        <w:t>结果的分析与</w:t>
+      </w:r>
+      <w:r>
+        <w:rPr>
+          <w:rFonts w:hint="eastAsia"/>
+        </w:rPr>
+        <w:t>评价</w:t>
+      </w:r>
+      <w:r>
+        <w:rPr>
+          <w:rFonts w:hint="eastAsia"/>
+        </w:rPr>
+        <w:t>（该部分</w:t>
+      </w:r>
+      <w:r>
+        <w:rPr>
+          <w:rFonts w:hint="eastAsia"/>
+        </w:rPr>
+        <w:t>如</w:t>
+      </w:r>
+      <w:r>
+        <w:rPr>
+          <w:rFonts w:hint="eastAsia"/>
+        </w:rPr>
+        <w:t>不够填写，请另加附页）</w:t>
       </w:r>
     </w:p>
     <w:p>
@@ -812,7 +1352,7 @@
           <w:rFonts w:ascii="Calibri" w:hAnsi="Calibri" w:eastAsia="SimSun"/>
           <w:sz w:val="21"/>
         </w:rPr>
-        <w:t xml:space="preserve">四、设备验证状态：adb devices 没有列出任何设备；因此安装、启动、根目录列表、模拟点击和实际运行截图尚未完成。</w:t>
+        <w:t xml:space="preserve">四、设备验证：Android 35 模拟器上安装与启动成功；ADB 根目录查看成功；ADB 模拟点击两次成功，界面 XML 分别出现 Hello, World! 与 こんにちは、世界！。</w:t>
       </w:r>
     </w:p>
     <w:p>
@@ -825,7 +1365,7 @@
           <w:rFonts w:ascii="Calibri" w:hAnsi="Calibri" w:eastAsia="SimSun"/>
           <w:sz w:val="21"/>
         </w:rPr>
-        <w:t xml:space="preserve">五、问题分析：本机已安装 Android SDK 的平台、构建工具、platform-tools 和 emulator 程序，但缺少系统镜像和 AVD；应在 Android Studio 的 Device Manager 创建虚拟设备并下载镜像。</w:t>
+        <w:t xml:space="preserve">五、问题分析：起初缺少 AVD 系统镜像，无法运行；安装 Android 35 x86_64 镜像并创建 AVD 后解决。首次构建缺少 ANDROID_HOME，设置 SDK 路径后解决。</w:t>
       </w:r>
     </w:p>
     <w:p>
@@ -838,7 +1378,7 @@
           <w:rFonts w:ascii="Calibri" w:hAnsi="Calibri" w:eastAsia="SimSun"/>
           <w:sz w:val="21"/>
         </w:rPr>
-        <w:t xml:space="preserve">六、后续验证：启动 AVD；运行 adb devices 确认状态为 device；安装 APK；启动 Activity；执行 adb shell ls /；用 uiautomator dump 确认按钮边界后执行 input tap；截图并对照三语输出。</w:t>
+        <w:t xml:space="preserve">六、运行截图：下方依次为中文初始界面、ADB 点击后的英语界面、ADB 点击后的日语界面；原始 PNG 与界面层级 XML 保存在 evidence 目录。</w:t>
       </w:r>
     </w:p>
     <w:p>
@@ -850,7 +1390,7 @@
           <w:rFonts w:ascii="Calibri" w:hAnsi="Calibri" w:eastAsia="SimSun"/>
           <w:sz w:val="21"/>
         </w:rPr>
-        <w:t xml:space="preserve">七、质量评价：纯代码界面、三语交互、三面国旗、自定义图标与姓名学号标题均已实现；设备实测和截图仍是待完成项。</w:t>
+        <w:t xml:space="preserve">七、质量评价：纯代码界面、三语交互、三面国旗、自定义图标与姓名学号标题已实现，构建及模拟器实测通过。</w:t>
       </w:r>
     </w:p>
     <w:p>
@@ -865,6 +1405,184 @@
         <w:t xml:space="preserve">八、仓库说明：按本人选择使用 GitHub 而非题目要求的 Gitee。若教师严格按 Gitee 检查，应另建 Gitee 仓库并替换报告链接。</w:t>
       </w:r>
     </w:p>
+    <w:tbl>
+      <w:tblPr>
+        <w:tblW w:w="8306" w:type="dxa"/>
+        <w:tblLayout w:type="fixed"/>
+      </w:tblPr>
+      <w:tblGrid>
+        <w:gridCol w:w="2768"/>
+        <w:gridCol w:w="2769"/>
+        <w:gridCol w:w="2769"/>
+      </w:tblGrid>
+      <w:tr>
+        <w:tc>
+          <w:tcPr>
+            <w:tcW w:w="2768" w:type="dxa"/>
+          </w:tcPr>
+          <w:p>
+            <w:pPr>
+              <w:jc w:val="center"/>
+            </w:pPr>
+            <w:r>
+              <w:drawing>
+                <wp:inline distT="0" distB="0" distL="0" distR="0">
+                  <wp:extent cx="1691640" cy="3759200"/>
+                  <wp:effectExtent l="0" t="0" r="0" b="0"/>
+                  <wp:docPr id="10" name="hello_zh.png" descr="图1 中文初始界面"/>
+                  <wp:cNvGraphicFramePr>
+                    <a:graphicFrameLocks noChangeAspect="1"/>
+                  </wp:cNvGraphicFramePr>
+                  <a:graphic>
+                    <a:graphicData uri="http://schemas.openxmlformats.org/drawingml/2006/picture">
+                      <pic:pic xmlns:pic="http://schemas.openxmlformats.org/drawingml/2006/picture">
+                        <pic:nvPicPr>
+                          <pic:cNvPr id="0" name="hello_zh.png"/>
+                          <pic:cNvPicPr/>
+                        </pic:nvPicPr>
+                        <pic:blipFill>
+                          <a:blip r:embed="Rb475154d8a624566"/>
+                          <a:stretch>
+                            <a:fillRect/>
+                          </a:stretch>
+                        </pic:blipFill>
+                        <pic:spPr>
+                          <a:xfrm>
+                            <a:off x="0" y="0"/>
+                            <a:ext cx="1691640" cy="3759200"/>
+                          </a:xfrm>
+                          <a:prstGeom prst="rect">
+                            <a:avLst/>
+                          </a:prstGeom>
+                        </pic:spPr>
+                      </pic:pic>
+                    </a:graphicData>
+                  </a:graphic>
+                </wp:inline>
+              </w:drawing>
+            </w:r>
+          </w:p>
+          <w:p>
+            <w:pPr>
+              <w:jc w:val="center"/>
+            </w:pPr>
+            <w:r>
+              <w:t>图1 中文初始界面</w:t>
+            </w:r>
+          </w:p>
+        </w:tc>
+        <w:tc>
+          <w:tcPr>
+            <w:tcW w:w="2769" w:type="dxa"/>
+          </w:tcPr>
+          <w:p>
+            <w:pPr>
+              <w:jc w:val="center"/>
+            </w:pPr>
+            <w:r>
+              <w:drawing>
+                <wp:inline distT="0" distB="0" distL="0" distR="0">
+                  <wp:extent cx="1691640" cy="3759200"/>
+                  <wp:effectExtent l="0" t="0" r="0" b="0"/>
+                  <wp:docPr id="11" name="hello_en.png" descr="图2 ADB切换英语"/>
+                  <wp:cNvGraphicFramePr>
+                    <a:graphicFrameLocks noChangeAspect="1"/>
+                  </wp:cNvGraphicFramePr>
+                  <a:graphic>
+                    <a:graphicData uri="http://schemas.openxmlformats.org/drawingml/2006/picture">
+                      <pic:pic xmlns:pic="http://schemas.openxmlformats.org/drawingml/2006/picture">
+                        <pic:nvPicPr>
+                          <pic:cNvPr id="0" name="hello_en.png"/>
+                          <pic:cNvPicPr/>
+                        </pic:nvPicPr>
+                        <pic:blipFill>
+                          <a:blip r:embed="R458b36023fd54429"/>
+                          <a:stretch>
+                            <a:fillRect/>
+                          </a:stretch>
+                        </pic:blipFill>
+                        <pic:spPr>
+                          <a:xfrm>
+                            <a:off x="0" y="0"/>
+                            <a:ext cx="1691640" cy="3759200"/>
+                          </a:xfrm>
+                          <a:prstGeom prst="rect">
+                            <a:avLst/>
+                          </a:prstGeom>
+                        </pic:spPr>
+                      </pic:pic>
+                    </a:graphicData>
+                  </a:graphic>
+                </wp:inline>
+              </w:drawing>
+            </w:r>
+          </w:p>
+          <w:p>
+            <w:pPr>
+              <w:jc w:val="center"/>
+            </w:pPr>
+            <w:r>
+              <w:t>图2 ADB切换英语</w:t>
+            </w:r>
+          </w:p>
+        </w:tc>
+        <w:tc>
+          <w:tcPr>
+            <w:tcW w:w="2769" w:type="dxa"/>
+          </w:tcPr>
+          <w:p>
+            <w:pPr>
+              <w:jc w:val="center"/>
+            </w:pPr>
+            <w:r>
+              <w:drawing>
+                <wp:inline distT="0" distB="0" distL="0" distR="0">
+                  <wp:extent cx="1691640" cy="3759200"/>
+                  <wp:effectExtent l="0" t="0" r="0" b="0"/>
+                  <wp:docPr id="12" name="hello_ja.png" descr="图3 ADB切换日语"/>
+                  <wp:cNvGraphicFramePr>
+                    <a:graphicFrameLocks noChangeAspect="1"/>
+                  </wp:cNvGraphicFramePr>
+                  <a:graphic>
+                    <a:graphicData uri="http://schemas.openxmlformats.org/drawingml/2006/picture">
+                      <pic:pic xmlns:pic="http://schemas.openxmlformats.org/drawingml/2006/picture">
+                        <pic:nvPicPr>
+                          <pic:cNvPr id="0" name="hello_ja.png"/>
+                          <pic:cNvPicPr/>
+                        </pic:nvPicPr>
+                        <pic:blipFill>
+                          <a:blip r:embed="Rb30b5b4350a7410c"/>
+                          <a:stretch>
+                            <a:fillRect/>
+                          </a:stretch>
+                        </pic:blipFill>
+                        <pic:spPr>
+                          <a:xfrm>
+                            <a:off x="0" y="0"/>
+                            <a:ext cx="1691640" cy="3759200"/>
+                          </a:xfrm>
+                          <a:prstGeom prst="rect">
+                            <a:avLst/>
+                          </a:prstGeom>
+                        </pic:spPr>
+                      </pic:pic>
+                    </a:graphicData>
+                  </a:graphic>
+                </wp:inline>
+              </w:drawing>
+            </w:r>
+          </w:p>
+          <w:p>
+            <w:pPr>
+              <w:jc w:val="center"/>
+            </w:pPr>
+            <w:r>
+              <w:t>图3 ADB切换日语</w:t>
+            </w:r>
+          </w:p>
+        </w:tc>
+      </w:tr>
+    </w:tbl>
     <w:p/>
     <w:p>
       <w:r>
@@ -947,7 +1665,115 @@
         <w:rPr>
           <w:rFonts w:hint="eastAsia"/>
         </w:rPr>
-        <w:t xml:space="preserve">注：实验成绩等级分为（90－100分）优，（80－89分）良，(70-79分)中，（60－69分）及格，（59分）不及格。</w:t>
+        <w:t>注：实验成绩等级分为（</w:t>
+      </w:r>
+      <w:r>
+        <w:rPr>
+          <w:rFonts w:hint="eastAsia"/>
+        </w:rPr>
+        <w:t>90</w:t>
+      </w:r>
+      <w:r>
+        <w:rPr>
+          <w:rFonts w:hint="eastAsia"/>
+        </w:rPr>
+        <w:t>－</w:t>
+      </w:r>
+      <w:r>
+        <w:rPr>
+          <w:rFonts w:hint="eastAsia"/>
+        </w:rPr>
+        <w:t>100</w:t>
+      </w:r>
+      <w:r>
+        <w:rPr>
+          <w:rFonts w:hint="eastAsia"/>
+        </w:rPr>
+        <w:t>分）优，（</w:t>
+      </w:r>
+      <w:r>
+        <w:rPr>
+          <w:rFonts w:hint="eastAsia"/>
+        </w:rPr>
+        <w:t>80</w:t>
+      </w:r>
+      <w:r>
+        <w:rPr>
+          <w:rFonts w:hint="eastAsia"/>
+        </w:rPr>
+        <w:t>－</w:t>
+      </w:r>
+      <w:r>
+        <w:rPr>
+          <w:rFonts w:hint="eastAsia"/>
+        </w:rPr>
+        <w:t>89</w:t>
+      </w:r>
+      <w:r>
+        <w:rPr>
+          <w:rFonts w:hint="eastAsia"/>
+        </w:rPr>
+        <w:t>分）良，</w:t>
+      </w:r>
+      <w:r>
+        <w:rPr>
+          <w:rFonts w:hint="eastAsia"/>
+        </w:rPr>
+        <w:t>(70-79</w:t>
+      </w:r>
+      <w:r>
+        <w:rPr>
+          <w:rFonts w:hint="eastAsia"/>
+        </w:rPr>
+        <w:t>分</w:t>
+      </w:r>
+      <w:r>
+        <w:rPr>
+          <w:rFonts w:hint="eastAsia"/>
+        </w:rPr>
+        <w:t>)</w:t>
+      </w:r>
+      <w:r>
+        <w:rPr>
+          <w:rFonts w:hint="eastAsia"/>
+        </w:rPr>
+        <w:t>中，（</w:t>
+      </w:r>
+      <w:r>
+        <w:rPr>
+          <w:rFonts w:hint="eastAsia"/>
+        </w:rPr>
+        <w:t>60</w:t>
+      </w:r>
+      <w:r>
+        <w:rPr>
+          <w:rFonts w:hint="eastAsia"/>
+        </w:rPr>
+        <w:t>－</w:t>
+      </w:r>
+      <w:r>
+        <w:rPr>
+          <w:rFonts w:hint="eastAsia"/>
+        </w:rPr>
+        <w:t>69</w:t>
+      </w:r>
+      <w:r>
+        <w:rPr>
+          <w:rFonts w:hint="eastAsia"/>
+        </w:rPr>
+        <w:t>分）及格，（</w:t>
+      </w:r>
+      <w:r>
+        <w:rPr>
+          <w:rFonts w:hint="eastAsia"/>
+        </w:rPr>
+        <w:t>59</w:t>
+      </w:r>
+      <w:r>
+        <w:rPr>
+          <w:rFonts w:hint="eastAsia"/>
+        </w:rPr>
+        <w:t>分）不及格。</w:t>
       </w:r>
     </w:p>
     <w:sectPr>

</xml_diff>

<commit_message>
Show student name and ID in app header
</commit_message>
<xml_diff>
--- a/实验报告_张雨鑫_2024110548.docx
+++ b/实验报告_张雨鑫_2024110548.docx
@@ -184,43 +184,7 @@
           <w:sz w:val="28"/>
           <w:szCs w:val="28"/>
         </w:rPr>
-        <w:t>实验</w:t>
-      </w:r>
-      <w:r>
-        <w:rPr>
-          <w:rFonts w:hint="eastAsia"/>
-          <w:b/>
-          <w:sz w:val="28"/>
-          <w:szCs w:val="28"/>
-        </w:rPr>
-        <w:t>一</w:t>
-      </w:r>
-      <w:r>
-        <w:rPr>
-          <w:rFonts w:hint="eastAsia"/>
-          <w:b/>
-          <w:sz w:val="28"/>
-          <w:szCs w:val="28"/>
-        </w:rPr>
-        <w:t xml:space="preserve">  </w:t>
-      </w:r>
-      <w:r>
-        <w:rPr>
-          <w:rFonts w:hint="eastAsia"/>
-          <w:b/>
-          <w:sz w:val="28"/>
-          <w:szCs w:val="28"/>
-        </w:rPr>
-        <w:t>多语言版本</w:t>
-      </w:r>
-      <w:r>
-        <w:rPr>
-          <w:rFonts w:hint="eastAsia"/>
-          <w:b/>
-          <w:sz w:val="28"/>
-          <w:szCs w:val="28"/>
-        </w:rPr>
-        <w:t>Hello World</w:t>
+        <w:t xml:space="preserve">实验一  多语言版本Hello World</w:t>
       </w:r>
     </w:p>
     <w:p>
@@ -261,13 +225,7 @@
         <w:rPr>
           <w:rFonts w:hint="eastAsia"/>
         </w:rPr>
-        <w:t>1</w:t>
-      </w:r>
-      <w:r>
-        <w:rPr>
-          <w:rFonts w:hint="eastAsia"/>
-        </w:rPr>
-        <w:t>、实验目的</w:t>
+        <w:t xml:space="preserve">1、实验目的</w:t>
       </w:r>
     </w:p>
     <w:p>
@@ -278,25 +236,7 @@
         <w:rPr>
           <w:rFonts w:hint="eastAsia"/>
         </w:rPr>
-        <w:t xml:space="preserve">(1) </w:t>
-      </w:r>
-      <w:r>
-        <w:rPr>
-          <w:rFonts w:hint="eastAsia"/>
-        </w:rPr>
-        <w:t>熟悉</w:t>
-      </w:r>
-      <w:r>
-        <w:rPr>
-          <w:rFonts w:hint="eastAsia"/>
-        </w:rPr>
-        <w:t>Android studio</w:t>
-      </w:r>
-      <w:r>
-        <w:rPr>
-          <w:rFonts w:hint="eastAsia"/>
-        </w:rPr>
-        <w:t>安装配置</w:t>
+        <w:t xml:space="preserve">(1) 熟悉Android studio安装配置</w:t>
       </w:r>
     </w:p>
     <w:p>
@@ -307,13 +247,7 @@
         <w:rPr>
           <w:rFonts w:hint="eastAsia"/>
         </w:rPr>
-        <w:t xml:space="preserve">(2) </w:t>
-      </w:r>
-      <w:r>
-        <w:rPr>
-          <w:rFonts w:hint="eastAsia"/>
-        </w:rPr>
-        <w:t>搭建环境以及开发第一个应用程序</w:t>
+        <w:t xml:space="preserve">(2) 搭建环境以及开发第一个应用程序</w:t>
       </w:r>
     </w:p>
     <w:p>
@@ -324,13 +258,7 @@
         <w:rPr>
           <w:rFonts w:hint="eastAsia"/>
         </w:rPr>
-        <w:t>2</w:t>
-      </w:r>
-      <w:r>
-        <w:rPr>
-          <w:rFonts w:hint="eastAsia"/>
-        </w:rPr>
-        <w:t>、实验要求</w:t>
+        <w:t xml:space="preserve">2、实验要求</w:t>
       </w:r>
     </w:p>
     <w:p>
@@ -341,13 +269,7 @@
         <w:rPr>
           <w:rFonts w:hint="eastAsia"/>
         </w:rPr>
-        <w:t xml:space="preserve">(1) </w:t>
-      </w:r>
-      <w:r>
-        <w:rPr>
-          <w:rFonts w:hint="eastAsia"/>
-        </w:rPr>
-        <w:t>认真填写实验报告，要求附加部分运行界面和主要代码；</w:t>
+        <w:t xml:space="preserve">(1) 认真填写实验报告，要求附加部分运行界面和主要代码；</w:t>
       </w:r>
     </w:p>
     <w:p>
@@ -358,13 +280,7 @@
         <w:rPr>
           <w:rFonts w:hint="eastAsia"/>
         </w:rPr>
-        <w:t xml:space="preserve">(2) </w:t>
-      </w:r>
-      <w:r>
-        <w:rPr>
-          <w:rFonts w:hint="eastAsia"/>
-        </w:rPr>
-        <w:t>对设计好的程序，检查输出是否符合预期，如有错请分析错误原因并解决；</w:t>
+        <w:t xml:space="preserve">(2) 对设计好的程序，检查输出是否符合预期，如有错请分析错误原因并解决；</w:t>
       </w:r>
     </w:p>
     <w:p/>
@@ -391,64 +307,10 @@
         <w:rPr>
           <w:rFonts w:hint="eastAsia"/>
         </w:rPr>
-        <w:t>搭建</w:t>
-      </w:r>
-      <w:r>
-        <w:rPr>
-          <w:rFonts w:hint="eastAsia"/>
-        </w:rPr>
-        <w:t>Android studio</w:t>
-      </w:r>
-      <w:r>
-        <w:rPr>
-          <w:rFonts w:hint="eastAsia"/>
-        </w:rPr>
-        <w:t>开发环境，参考课程教学视频，完成基于多语言版本纯代码交互式</w:t>
-      </w:r>
-      <w:r>
-        <w:rPr>
-          <w:rFonts w:hint="eastAsia"/>
-        </w:rPr>
-        <w:t>Hello World App</w:t>
-      </w:r>
-      <w:r>
-        <w:rPr>
-          <w:rFonts w:hint="eastAsia"/>
-        </w:rPr>
-        <w:t>，在手机模拟器上运行该</w:t>
-      </w:r>
-      <w:r>
-        <w:rPr>
-          <w:rFonts w:hint="eastAsia"/>
-        </w:rPr>
-        <w:t>APP</w:t>
-      </w:r>
-      <w:r>
-        <w:rPr>
-          <w:rFonts w:hint="eastAsia"/>
-        </w:rPr>
-        <w:t>，使用</w:t>
+        <w:t xml:space="preserve">搭建Android studio开发环境，参考课程教学视频，完成基于多语言版本纯代码交互式Hello World App，在手机模拟器上运行该APP，使用adb shell进入手机模拟器显示根目录，具体要求：</w:t>
       </w:r>
       <w:proofErr w:type="spellStart"/>
-      <w:r>
-        <w:rPr>
-          <w:rFonts w:hint="eastAsia"/>
-        </w:rPr>
-        <w:t>adb</w:t>
-      </w:r>
       <w:proofErr w:type="spellEnd"/>
-      <w:r>
-        <w:rPr>
-          <w:rFonts w:hint="eastAsia"/>
-        </w:rPr>
-        <w:t xml:space="preserve"> shell</w:t>
-      </w:r>
-      <w:r>
-        <w:rPr>
-          <w:rFonts w:hint="eastAsia"/>
-        </w:rPr>
-        <w:t>进入手机模拟器显示根目录，具体要求：</w:t>
-      </w:r>
     </w:p>
     <w:p>
       <w:pPr>
@@ -459,25 +321,7 @@
         <w:rPr>
           <w:rFonts w:hint="eastAsia"/>
         </w:rPr>
-        <w:t xml:space="preserve">(1) </w:t>
-      </w:r>
-      <w:r>
-        <w:rPr>
-          <w:rFonts w:hint="eastAsia"/>
-        </w:rPr>
-        <w:t>搭建</w:t>
-      </w:r>
-      <w:r>
-        <w:rPr>
-          <w:rFonts w:hint="eastAsia"/>
-        </w:rPr>
-        <w:t>Android</w:t>
-      </w:r>
-      <w:r>
-        <w:rPr>
-          <w:rFonts w:hint="eastAsia"/>
-        </w:rPr>
-        <w:t>开发环境</w:t>
+        <w:t xml:space="preserve">(1) 搭建Android开发环境</w:t>
       </w:r>
     </w:p>
     <w:p>
@@ -489,25 +333,7 @@
         <w:rPr>
           <w:rFonts w:hint="eastAsia"/>
         </w:rPr>
-        <w:t xml:space="preserve">a) </w:t>
-      </w:r>
-      <w:r>
-        <w:rPr>
-          <w:rFonts w:hint="eastAsia"/>
-        </w:rPr>
-        <w:t>安装</w:t>
-      </w:r>
-      <w:r>
-        <w:rPr>
-          <w:rFonts w:hint="eastAsia"/>
-        </w:rPr>
-        <w:t>JDK</w:t>
-      </w:r>
-      <w:r>
-        <w:rPr>
-          <w:rFonts w:hint="eastAsia"/>
-        </w:rPr>
-        <w:t>；</w:t>
+        <w:t xml:space="preserve">a) 安装JDK；</w:t>
       </w:r>
     </w:p>
     <w:p>
@@ -519,25 +345,7 @@
         <w:rPr>
           <w:rFonts w:hint="eastAsia"/>
         </w:rPr>
-        <w:t xml:space="preserve">b) </w:t>
-      </w:r>
-      <w:r>
-        <w:rPr>
-          <w:rFonts w:hint="eastAsia"/>
-        </w:rPr>
-        <w:t>安装</w:t>
-      </w:r>
-      <w:r>
-        <w:rPr>
-          <w:rFonts w:hint="eastAsia"/>
-        </w:rPr>
-        <w:t>Android Studio</w:t>
-      </w:r>
-      <w:r>
-        <w:rPr>
-          <w:rFonts w:hint="eastAsia"/>
-        </w:rPr>
-        <w:t>；</w:t>
+        <w:t xml:space="preserve">b) 安装Android Studio；</w:t>
       </w:r>
     </w:p>
     <w:p>
@@ -549,25 +357,7 @@
         <w:rPr>
           <w:rFonts w:hint="eastAsia"/>
         </w:rPr>
-        <w:t xml:space="preserve">(2) </w:t>
-      </w:r>
-      <w:r>
-        <w:rPr>
-          <w:rFonts w:hint="eastAsia"/>
-        </w:rPr>
-        <w:t>支持三种语言版本的交互式</w:t>
-      </w:r>
-      <w:r>
-        <w:rPr>
-          <w:rFonts w:hint="eastAsia"/>
-        </w:rPr>
-        <w:t>Hello World</w:t>
-      </w:r>
-      <w:r>
-        <w:rPr>
-          <w:rFonts w:hint="eastAsia"/>
-        </w:rPr>
-        <w:t>；</w:t>
+        <w:t xml:space="preserve">(2) 支持三种语言版本的交互式Hello World；</w:t>
       </w:r>
     </w:p>
     <w:p>
@@ -579,25 +369,7 @@
         <w:rPr>
           <w:rFonts w:hint="eastAsia"/>
         </w:rPr>
-        <w:t xml:space="preserve">a) </w:t>
-      </w:r>
-      <w:r>
-        <w:rPr>
-          <w:rFonts w:hint="eastAsia"/>
-        </w:rPr>
-        <w:t>自己下载第</w:t>
-      </w:r>
-      <w:r>
-        <w:rPr>
-          <w:rFonts w:hint="eastAsia"/>
-        </w:rPr>
-        <w:t>3</w:t>
-      </w:r>
-      <w:r>
-        <w:rPr>
-          <w:rFonts w:hint="eastAsia"/>
-        </w:rPr>
-        <w:t>种语言的国旗图片资源；</w:t>
+        <w:t xml:space="preserve">a) 自己下载第3种语言的国旗图片资源；</w:t>
       </w:r>
     </w:p>
     <w:p>
@@ -609,55 +381,7 @@
         <w:rPr>
           <w:rFonts w:hint="eastAsia"/>
         </w:rPr>
-        <w:t xml:space="preserve">b) </w:t>
-      </w:r>
-      <w:r>
-        <w:rPr>
-          <w:rFonts w:hint="eastAsia"/>
-        </w:rPr>
-        <w:t>改变安装在</w:t>
-      </w:r>
-      <w:r>
-        <w:rPr>
-          <w:rFonts w:hint="eastAsia"/>
-        </w:rPr>
-        <w:t>Android</w:t>
-      </w:r>
-      <w:r>
-        <w:rPr>
-          <w:rFonts w:hint="eastAsia"/>
-        </w:rPr>
-        <w:t>上的</w:t>
-      </w:r>
-      <w:r>
-        <w:rPr>
-          <w:rFonts w:hint="eastAsia"/>
-        </w:rPr>
-        <w:t>APP</w:t>
-      </w:r>
-      <w:r>
-        <w:rPr>
-          <w:rFonts w:hint="eastAsia"/>
-        </w:rPr>
-        <w:t>图标；</w:t>
-      </w:r>
-      <w:r>
-        <w:rPr>
-          <w:rFonts w:hint="eastAsia"/>
-        </w:rPr>
-        <w:t>(</w:t>
-      </w:r>
-      <w:r>
-        <w:rPr>
-          <w:rFonts w:hint="eastAsia"/>
-        </w:rPr>
-        <w:t>参考</w:t>
-      </w:r>
-      <w:r>
-        <w:rPr>
-          <w:rFonts w:hint="eastAsia"/>
-        </w:rPr>
-        <w:t>:https://developer.android.google.cn/codelabs/basic-android-kotlin-compose-training-change-app-icon?hl=zh-cn#0)</w:t>
+        <w:t xml:space="preserve">b) 改变安装在Android上的APP图标；(参考:https://developer.android.google.cn/codelabs/basic-android-kotlin-compose-training-change-app-icon?hl=zh-cn#0)</w:t>
       </w:r>
     </w:p>
     <w:p>
@@ -669,31 +393,7 @@
         <w:rPr>
           <w:rFonts w:hint="eastAsia"/>
         </w:rPr>
-        <w:t xml:space="preserve">(3) </w:t>
-      </w:r>
-      <w:r>
-        <w:rPr>
-          <w:rFonts w:hint="eastAsia"/>
-        </w:rPr>
-        <w:t>不采用布局文件，而是将界面部分改为纯代码实现（</w:t>
-      </w:r>
-      <w:r>
-        <w:rPr>
-          <w:rFonts w:hint="eastAsia"/>
-        </w:rPr>
-        <w:t>pure code</w:t>
-      </w:r>
-      <w:r>
-        <w:rPr>
-          <w:rFonts w:hint="eastAsia"/>
-        </w:rPr>
-        <w:t>）；</w:t>
-      </w:r>
-      <w:r>
-        <w:rPr>
-          <w:rFonts w:hint="eastAsia"/>
-        </w:rPr>
-        <w:t xml:space="preserve"> </w:t>
+        <w:t xml:space="preserve">(3) 不采用布局文件，而是将界面部分改为纯代码实现（pure code）； </w:t>
       </w:r>
     </w:p>
     <w:p>
@@ -705,40 +405,10 @@
         <w:rPr>
           <w:rFonts w:hint="eastAsia"/>
         </w:rPr>
-        <w:t xml:space="preserve">(4) </w:t>
-      </w:r>
-      <w:r>
-        <w:rPr>
-          <w:rFonts w:hint="eastAsia"/>
-        </w:rPr>
-        <w:t>使用</w:t>
+        <w:t xml:space="preserve">(4) 使用adb调试APP；</w:t>
       </w:r>
       <w:proofErr w:type="spellStart"/>
-      <w:r>
-        <w:rPr>
-          <w:rFonts w:hint="eastAsia"/>
-        </w:rPr>
-        <w:t>adb</w:t>
-      </w:r>
       <w:proofErr w:type="spellEnd"/>
-      <w:r>
-        <w:rPr>
-          <w:rFonts w:hint="eastAsia"/>
-        </w:rPr>
-        <w:t>调试</w:t>
-      </w:r>
-      <w:r>
-        <w:rPr>
-          <w:rFonts w:hint="eastAsia"/>
-        </w:rPr>
-        <w:t>APP</w:t>
-      </w:r>
-      <w:r>
-        <w:rPr>
-          <w:rFonts w:hint="eastAsia"/>
-        </w:rPr>
-        <w:t>；</w:t>
-      </w:r>
     </w:p>
     <w:p>
       <w:pPr>
@@ -749,40 +419,10 @@
         <w:rPr>
           <w:rFonts w:hint="eastAsia"/>
         </w:rPr>
-        <w:t xml:space="preserve">a) </w:t>
+        <w:t xml:space="preserve">a) adb shell安装并启动自己的APP；</w:t>
       </w:r>
       <w:proofErr w:type="spellStart"/>
-      <w:r>
-        <w:rPr>
-          <w:rFonts w:hint="eastAsia"/>
-        </w:rPr>
-        <w:t>adb</w:t>
-      </w:r>
       <w:proofErr w:type="spellEnd"/>
-      <w:r>
-        <w:rPr>
-          <w:rFonts w:hint="eastAsia"/>
-        </w:rPr>
-        <w:t xml:space="preserve"> shell</w:t>
-      </w:r>
-      <w:r>
-        <w:rPr>
-          <w:rFonts w:hint="eastAsia"/>
-        </w:rPr>
-        <w:t>安装并启动自己的</w:t>
-      </w:r>
-      <w:r>
-        <w:rPr>
-          <w:rFonts w:hint="eastAsia"/>
-        </w:rPr>
-        <w:t>APP</w:t>
-      </w:r>
-      <w:r>
-        <w:rPr>
-          <w:rFonts w:hint="eastAsia"/>
-        </w:rPr>
-        <w:t>；</w:t>
-      </w:r>
     </w:p>
     <w:p>
       <w:pPr>
@@ -793,28 +433,10 @@
         <w:rPr>
           <w:rFonts w:hint="eastAsia"/>
         </w:rPr>
-        <w:t xml:space="preserve">b) </w:t>
+        <w:t xml:space="preserve">b) adb shell模拟触摸按钮；</w:t>
       </w:r>
       <w:proofErr w:type="spellStart"/>
-      <w:r>
-        <w:rPr>
-          <w:rFonts w:hint="eastAsia"/>
-        </w:rPr>
-        <w:t>adb</w:t>
-      </w:r>
       <w:proofErr w:type="spellEnd"/>
-      <w:r>
-        <w:rPr>
-          <w:rFonts w:hint="eastAsia"/>
-        </w:rPr>
-        <w:t xml:space="preserve"> shell</w:t>
-      </w:r>
-      <w:r>
-        <w:rPr>
-          <w:rFonts w:hint="eastAsia"/>
-        </w:rPr>
-        <w:t>模拟触摸按钮；</w:t>
-      </w:r>
     </w:p>
     <w:p>
       <w:pPr>
@@ -825,28 +447,26 @@
         <w:rPr>
           <w:rFonts w:hint="eastAsia"/>
         </w:rPr>
-        <w:t xml:space="preserve">(5) </w:t>
-      </w:r>
-      <w:r>
-        <w:rPr>
-          <w:rFonts w:hint="eastAsia"/>
-        </w:rPr>
-        <w:t>将项目提交到</w:t>
+        <w:t xml:space="preserve">(5) 将项目提交到gitee上自己新建的项目里面；(参考:https://liaoxuefeng.com/books/git/introduction/index.html)</w:t>
       </w:r>
       <w:proofErr w:type="spellStart"/>
-      <w:r>
-        <w:rPr>
-          <w:rFonts w:hint="eastAsia"/>
-        </w:rPr>
-        <w:t>gitee</w:t>
-      </w:r>
       <w:proofErr w:type="spellEnd"/>
-      <w:r>
-        <w:rPr>
-          <w:rFonts w:hint="eastAsia"/>
-        </w:rPr>
-        <w:t>上自己新建的项目里面；</w:t>
-      </w:r>
+    </w:p>
+    <w:p>
+      <w:pPr>
+        <w:ind w:left="420" w:leftChars="200"/>
+      </w:pPr>
+      <w:r>
+        <w:rPr>
+          <w:rFonts w:hint="eastAsia"/>
+        </w:rPr>
+        <w:t>提交要求：</w:t>
+      </w:r>
+    </w:p>
+    <w:p>
+      <w:pPr>
+        <w:ind w:left="420" w:leftChars="200"/>
+      </w:pPr>
       <w:r>
         <w:rPr>
           <w:rFonts w:hint="eastAsia"/>
@@ -854,16 +474,22 @@
         <w:t>(</w:t>
       </w:r>
       <w:r>
-        <w:rPr>
-          <w:rFonts w:hint="eastAsia"/>
-        </w:rPr>
-        <w:t>参考</w:t>
-      </w:r>
-      <w:r>
-        <w:rPr>
-          <w:rFonts w:hint="eastAsia"/>
-        </w:rPr>
-        <w:t>:https://liaoxuefeng.com/books/git/introduction/index.html)</w:t>
+        <w:t>1</w:t>
+      </w:r>
+      <w:r>
+        <w:rPr>
+          <w:rFonts w:hint="eastAsia"/>
+        </w:rPr>
+        <w:t>)</w:t>
+      </w:r>
+      <w:r>
+        <w:t xml:space="preserve">  </w:t>
+      </w:r>
+      <w:r>
+        <w:rPr>
+          <w:rFonts w:hint="eastAsia"/>
+        </w:rPr>
+        <w:t xml:space="preserve">APP应用标题为自己的“姓名+学号”</w:t>
       </w:r>
     </w:p>
     <w:p>
@@ -874,64 +500,6 @@
         <w:rPr>
           <w:rFonts w:hint="eastAsia"/>
         </w:rPr>
-        <w:t>提交要求：</w:t>
-      </w:r>
-    </w:p>
-    <w:p>
-      <w:pPr>
-        <w:ind w:left="420" w:leftChars="200"/>
-      </w:pPr>
-      <w:r>
-        <w:rPr>
-          <w:rFonts w:hint="eastAsia"/>
-        </w:rPr>
-        <w:t>(</w:t>
-      </w:r>
-      <w:r>
-        <w:t>1</w:t>
-      </w:r>
-      <w:r>
-        <w:rPr>
-          <w:rFonts w:hint="eastAsia"/>
-        </w:rPr>
-        <w:t>)</w:t>
-      </w:r>
-      <w:r>
-        <w:t xml:space="preserve">  </w:t>
-      </w:r>
-      <w:r>
-        <w:rPr>
-          <w:rFonts w:hint="eastAsia"/>
-        </w:rPr>
-        <w:t>APP</w:t>
-      </w:r>
-      <w:r>
-        <w:rPr>
-          <w:rFonts w:hint="eastAsia"/>
-        </w:rPr>
-        <w:t>应用标题为自己的“姓名</w:t>
-      </w:r>
-      <w:r>
-        <w:rPr>
-          <w:rFonts w:hint="eastAsia"/>
-        </w:rPr>
-        <w:t>+</w:t>
-      </w:r>
-      <w:r>
-        <w:rPr>
-          <w:rFonts w:hint="eastAsia"/>
-        </w:rPr>
-        <w:t>学号”</w:t>
-      </w:r>
-    </w:p>
-    <w:p>
-      <w:pPr>
-        <w:ind w:left="420" w:leftChars="200"/>
-      </w:pPr>
-      <w:r>
-        <w:rPr>
-          <w:rFonts w:hint="eastAsia"/>
-        </w:rPr>
         <w:t>(2)</w:t>
       </w:r>
       <w:r>
@@ -941,34 +509,10 @@
         <w:rPr>
           <w:rFonts w:hint="eastAsia"/>
         </w:rPr>
-        <w:t>用附件形式提交实验报告（实验报告</w:t>
-      </w:r>
-      <w:r>
-        <w:rPr>
-          <w:rFonts w:hint="eastAsia"/>
-        </w:rPr>
-        <w:t>需要</w:t>
-      </w:r>
-      <w:r>
-        <w:rPr>
-          <w:rFonts w:hint="eastAsia"/>
-        </w:rPr>
-        <w:t>附上项目的</w:t>
+        <w:t xml:space="preserve">用附件形式提交实验报告（实验报告需要附上项目的gitee地址）</w:t>
       </w:r>
       <w:proofErr w:type="spellStart"/>
-      <w:r>
-        <w:rPr>
-          <w:rFonts w:hint="eastAsia"/>
-        </w:rPr>
-        <w:t>gitee</w:t>
-      </w:r>
       <w:proofErr w:type="spellEnd"/>
-      <w:r>
-        <w:rPr>
-          <w:rFonts w:hint="eastAsia"/>
-        </w:rPr>
-        <w:t>地址）</w:t>
-      </w:r>
     </w:p>
     <w:p>
       <w:pPr>
@@ -997,61 +541,7 @@
         <w:rPr>
           <w:rFonts w:hint="eastAsia"/>
         </w:rPr>
-        <w:t>截图和说明，以及作品最终运行</w:t>
-      </w:r>
-      <w:r>
-        <w:rPr>
-          <w:rFonts w:hint="eastAsia"/>
-        </w:rPr>
-        <w:t>过程</w:t>
-      </w:r>
-      <w:r>
-        <w:rPr>
-          <w:rFonts w:hint="eastAsia"/>
-        </w:rPr>
-        <w:t>的</w:t>
-      </w:r>
-      <w:r>
-        <w:rPr>
-          <w:rFonts w:hint="eastAsia"/>
-        </w:rPr>
-        <w:t>截图（</w:t>
-      </w:r>
-      <w:r>
-        <w:rPr>
-          <w:rFonts w:hint="eastAsia"/>
-        </w:rPr>
-        <w:t>照片</w:t>
-      </w:r>
-      <w:r>
-        <w:rPr>
-          <w:rFonts w:hint="eastAsia"/>
-        </w:rPr>
-        <w:t>）</w:t>
-      </w:r>
-      <w:r>
-        <w:rPr>
-          <w:rFonts w:hint="eastAsia"/>
-        </w:rPr>
-        <w:t>和说明</w:t>
-      </w:r>
-      <w:r>
-        <w:rPr>
-          <w:rFonts w:hint="eastAsia"/>
-        </w:rPr>
-        <w:t>（该部分</w:t>
-      </w:r>
-      <w:r>
-        <w:rPr>
-          <w:rFonts w:hint="eastAsia"/>
-        </w:rPr>
-        <w:t>如</w:t>
-      </w:r>
-      <w:r>
-        <w:rPr>
-          <w:rFonts w:hint="eastAsia"/>
-        </w:rPr>
-        <w:t>不够填写，请另加附页）</w:t>
+        <w:t xml:space="preserve">截图和说明，以及作品最终运行过程的截图（照片）和说明（该部分如不够填写，请另加附页）</w:t>
       </w:r>
     </w:p>
     <w:p>
@@ -1100,7 +590,7 @@
           <w:rFonts w:ascii="Calibri" w:hAnsi="Calibri" w:eastAsia="SimSun"/>
           <w:sz w:val="21"/>
         </w:rPr>
-        <w:t xml:space="preserve">应用标题设置为“张雨鑫2024110548”；使用 adaptive icon，自绘对白框和彩色条纹，替换默认启动图标。</w:t>
+        <w:t xml:space="preserve">桌面应用名与页面顶部标题均设置为“张雨鑫2024110548”（title.setText(R.string.app_name)）；使用 adaptive icon，自绘对白框和彩色条纹，替换默认启动图标。</w:t>
       </w:r>
     </w:p>
     <w:p>
@@ -1272,37 +762,7 @@
         <w:rPr>
           <w:rFonts w:hint="eastAsia"/>
         </w:rPr>
-        <w:t>实验</w:t>
-      </w:r>
-      <w:r>
-        <w:rPr>
-          <w:rFonts w:hint="eastAsia"/>
-        </w:rPr>
-        <w:t>结果的分析与</w:t>
-      </w:r>
-      <w:r>
-        <w:rPr>
-          <w:rFonts w:hint="eastAsia"/>
-        </w:rPr>
-        <w:t>评价</w:t>
-      </w:r>
-      <w:r>
-        <w:rPr>
-          <w:rFonts w:hint="eastAsia"/>
-        </w:rPr>
-        <w:t>（该部分</w:t>
-      </w:r>
-      <w:r>
-        <w:rPr>
-          <w:rFonts w:hint="eastAsia"/>
-        </w:rPr>
-        <w:t>如</w:t>
-      </w:r>
-      <w:r>
-        <w:rPr>
-          <w:rFonts w:hint="eastAsia"/>
-        </w:rPr>
-        <w:t>不够填写，请另加附页）</w:t>
+        <w:t xml:space="preserve">实验结果的分析与评价（该部分如不够填写，请另加附页）</w:t>
       </w:r>
     </w:p>
     <w:p>
@@ -1441,7 +901,7 @@
                           <pic:cNvPicPr/>
                         </pic:nvPicPr>
                         <pic:blipFill>
-                          <a:blip r:embed="Rb475154d8a624566"/>
+                          <a:blip r:embed="Rceeddec233634c45"/>
                           <a:stretch>
                             <a:fillRect/>
                           </a:stretch>
@@ -1496,7 +956,7 @@
                           <pic:cNvPicPr/>
                         </pic:nvPicPr>
                         <pic:blipFill>
-                          <a:blip r:embed="R458b36023fd54429"/>
+                          <a:blip r:embed="R461784ba9e1e4a90"/>
                           <a:stretch>
                             <a:fillRect/>
                           </a:stretch>
@@ -1551,7 +1011,7 @@
                           <pic:cNvPicPr/>
                         </pic:nvPicPr>
                         <pic:blipFill>
-                          <a:blip r:embed="Rb30b5b4350a7410c"/>
+                          <a:blip r:embed="R26ee6fa295cc4dfb"/>
                           <a:stretch>
                             <a:fillRect/>
                           </a:stretch>
@@ -1665,115 +1125,7 @@
         <w:rPr>
           <w:rFonts w:hint="eastAsia"/>
         </w:rPr>
-        <w:t>注：实验成绩等级分为（</w:t>
-      </w:r>
-      <w:r>
-        <w:rPr>
-          <w:rFonts w:hint="eastAsia"/>
-        </w:rPr>
-        <w:t>90</w:t>
-      </w:r>
-      <w:r>
-        <w:rPr>
-          <w:rFonts w:hint="eastAsia"/>
-        </w:rPr>
-        <w:t>－</w:t>
-      </w:r>
-      <w:r>
-        <w:rPr>
-          <w:rFonts w:hint="eastAsia"/>
-        </w:rPr>
-        <w:t>100</w:t>
-      </w:r>
-      <w:r>
-        <w:rPr>
-          <w:rFonts w:hint="eastAsia"/>
-        </w:rPr>
-        <w:t>分）优，（</w:t>
-      </w:r>
-      <w:r>
-        <w:rPr>
-          <w:rFonts w:hint="eastAsia"/>
-        </w:rPr>
-        <w:t>80</w:t>
-      </w:r>
-      <w:r>
-        <w:rPr>
-          <w:rFonts w:hint="eastAsia"/>
-        </w:rPr>
-        <w:t>－</w:t>
-      </w:r>
-      <w:r>
-        <w:rPr>
-          <w:rFonts w:hint="eastAsia"/>
-        </w:rPr>
-        <w:t>89</w:t>
-      </w:r>
-      <w:r>
-        <w:rPr>
-          <w:rFonts w:hint="eastAsia"/>
-        </w:rPr>
-        <w:t>分）良，</w:t>
-      </w:r>
-      <w:r>
-        <w:rPr>
-          <w:rFonts w:hint="eastAsia"/>
-        </w:rPr>
-        <w:t>(70-79</w:t>
-      </w:r>
-      <w:r>
-        <w:rPr>
-          <w:rFonts w:hint="eastAsia"/>
-        </w:rPr>
-        <w:t>分</w:t>
-      </w:r>
-      <w:r>
-        <w:rPr>
-          <w:rFonts w:hint="eastAsia"/>
-        </w:rPr>
-        <w:t>)</w:t>
-      </w:r>
-      <w:r>
-        <w:rPr>
-          <w:rFonts w:hint="eastAsia"/>
-        </w:rPr>
-        <w:t>中，（</w:t>
-      </w:r>
-      <w:r>
-        <w:rPr>
-          <w:rFonts w:hint="eastAsia"/>
-        </w:rPr>
-        <w:t>60</w:t>
-      </w:r>
-      <w:r>
-        <w:rPr>
-          <w:rFonts w:hint="eastAsia"/>
-        </w:rPr>
-        <w:t>－</w:t>
-      </w:r>
-      <w:r>
-        <w:rPr>
-          <w:rFonts w:hint="eastAsia"/>
-        </w:rPr>
-        <w:t>69</w:t>
-      </w:r>
-      <w:r>
-        <w:rPr>
-          <w:rFonts w:hint="eastAsia"/>
-        </w:rPr>
-        <w:t>分）及格，（</w:t>
-      </w:r>
-      <w:r>
-        <w:rPr>
-          <w:rFonts w:hint="eastAsia"/>
-        </w:rPr>
-        <w:t>59</w:t>
-      </w:r>
-      <w:r>
-        <w:rPr>
-          <w:rFonts w:hint="eastAsia"/>
-        </w:rPr>
-        <w:t>分）不及格。</w:t>
+        <w:t xml:space="preserve">注：实验成绩等级分为（90－100分）优，（80－89分）良，(70-79分)中，（60－69分）及格，（59分）不及格。</w:t>
       </w:r>
     </w:p>
     <w:sectPr>

</xml_diff>

<commit_message>
Rename Android package to student namespace
</commit_message>
<xml_diff>
--- a/实验报告_张雨鑫_2024110548.docx
+++ b/实验报告_张雨鑫_2024110548.docx
@@ -578,7 +578,7 @@
           <w:rFonts w:ascii="Calibri" w:hAnsi="Calibri" w:eastAsia="SimSun"/>
           <w:sz w:val="21"/>
         </w:rPr>
-        <w:t xml:space="preserve">创建原生 Java Android 工程，包名 edu.sicnu.multilingualhello；界面全部在 MainActivity.buildScreen() 中用 ScrollView、LinearLayout、TextView、ImageView 和 Button 创建，没有使用 res/layout 布局文件。</w:t>
+        <w:t xml:space="preserve">创建原生 Java Android 工程，包名 cn.edu.sicnu.stu.zhangyuxin.first；界面全部在 MainActivity.buildScreen() 中用 ScrollView、LinearLayout、TextView、ImageView 和 Button 创建，没有使用 res/layout 布局文件。</w:t>
       </w:r>
     </w:p>
     <w:p>
@@ -724,7 +724,7 @@
           <w:rFonts w:ascii="Calibri" w:hAnsi="Calibri" w:eastAsia="SimSun"/>
           <w:sz w:val="21"/>
         </w:rPr>
-        <w:t xml:space="preserve">adb install -r app-debug.apk 返回 Success；adb shell am start -n edu.sicnu.multilingualhello/.MainActivity 成功启动；adb shell ls / 输出 acct、data、system 等根目录项。</w:t>
+        <w:t xml:space="preserve">adb install -r app-debug.apk 返回 Success；adb shell am start -n cn.edu.sicnu.stu.zhangyuxin.first/.MainActivity 成功启动；adb shell ls / 输出 acct、data、system 等根目录项。</w:t>
       </w:r>
     </w:p>
     <w:p>
@@ -748,7 +748,7 @@
           <w:rFonts w:ascii="Calibri" w:hAnsi="Calibri" w:eastAsia="SimSun"/>
           <w:sz w:val="21"/>
         </w:rPr>
-        <w:t xml:space="preserve">四、代码和资源位置：app/src/main/java/edu/sicnu/multilingualhello/MainActivity.java；app/src/main/res/drawable-nodpi；app/src/main/res/mipmap-anydpi-v26。</w:t>
+        <w:t xml:space="preserve">四、代码和资源位置：app/src/main/java/cn/edu/sicnu/stu/zhangyuxin/first/MainActivity.java；app/src/main/res/drawable-nodpi；app/src/main/res/mipmap-anydpi-v26。</w:t>
       </w:r>
     </w:p>
     <w:p>
@@ -901,7 +901,7 @@
                           <pic:cNvPicPr/>
                         </pic:nvPicPr>
                         <pic:blipFill>
-                          <a:blip r:embed="Rceeddec233634c45"/>
+                          <a:blip r:embed="R6d804d2b85ab43a3"/>
                           <a:stretch>
                             <a:fillRect/>
                           </a:stretch>
@@ -956,7 +956,7 @@
                           <pic:cNvPicPr/>
                         </pic:nvPicPr>
                         <pic:blipFill>
-                          <a:blip r:embed="R461784ba9e1e4a90"/>
+                          <a:blip r:embed="Rf6c23b23ddf24182"/>
                           <a:stretch>
                             <a:fillRect/>
                           </a:stretch>
@@ -1011,7 +1011,7 @@
                           <pic:cNvPicPr/>
                         </pic:nvPicPr>
                         <pic:blipFill>
-                          <a:blip r:embed="R26ee6fa295cc4dfb"/>
+                          <a:blip r:embed="Readfe1696c3d49e4"/>
                           <a:stretch>
                             <a:fillRect/>
                           </a:stretch>

</xml_diff>